<commit_message>
fix: bad api url
</commit_message>
<xml_diff>
--- a/docx/lab2.docx
+++ b/docx/lab2.docx
@@ -347,20 +347,14 @@
       </w:r>
     </w:p>
     <w:p>
-      <w:pPr>
+      <w:r>
         <w:rPr>
           <w:b/>
           <w:bCs/>
           <w:lang w:val="en-US"/>
         </w:rPr>
-      </w:pPr>
-      <w:r>
-        <w:rPr>
-          <w:b/>
-          <w:bCs/>
-        </w:rPr>
         <w:lastRenderedPageBreak/>
-        <w:t>Код</w:t>
+        <w:t>1</w:t>
       </w:r>
       <w:r>
         <w:rPr>
@@ -368,82 +362,183 @@
           <w:bCs/>
           <w:lang w:val="en-US"/>
         </w:rPr>
-        <w:t xml:space="preserve">: </w:t>
-      </w:r>
-    </w:p>
-    <w:p>
-      <w:pPr>
+        <w:t xml:space="preserve">. </w:t>
+      </w:r>
+      <w:r>
+        <w:t>Закодоване</w:t>
+      </w:r>
+      <w:r>
+        <w:t xml:space="preserve"> </w:t>
+      </w:r>
+      <w:r>
         <w:rPr>
           <w:lang w:val="en-US"/>
         </w:rPr>
-      </w:pPr>
-      <w:r>
-        <w:rPr>
-          <w:b/>
-          <w:bCs/>
-        </w:rPr>
-        <w:t>Висновок</w:t>
-      </w:r>
+        <w:t xml:space="preserve">url: </w:t>
+      </w:r>
+      <w:r>
+        <w:t>course://web.backend?name=%D0%90%D1%80%D1%82%D1%83%D1%80%20%D0%9B%D0%B8%D1%81&amp;group=%D0%A4%D0%95%D0%9F-21%D1%81&amp;subgroup=%D0%9F%D1%96%D0%B4%D0%B3%D1%80%D1%83%D0%BF%D0%B0%201#%D0%90%D1%80%D1%82%D1%83%D1%80%D0%9B%D0%B8%D1%81</w:t>
+      </w:r>
+    </w:p>
+    <w:p>
       <w:r>
         <w:rPr>
           <w:b/>
           <w:bCs/>
           <w:lang w:val="en-US"/>
         </w:rPr>
-        <w:t>:</w:t>
-      </w:r>
-      <w:r>
+        <w:t>2.</w:t>
+      </w:r>
+      <w:r>
+        <w:t xml:space="preserve"> </w:t>
+      </w:r>
+      <w:r>
+        <w:rPr>
+          <w:lang w:val="en-US"/>
+        </w:rPr>
+        <w:t>https://bank.gov.ua/NBU_Exchange/exchange_site?start=20220707&amp;end=20220719&amp;valcode=usd&amp;sort=exchangedate&amp;order=desc&amp;json</w:t>
+      </w:r>
+      <w:r>
+        <w:rPr>
+          <w:noProof/>
+        </w:rPr>
+        <w:drawing>
+          <wp:inline distT="0" distB="0" distL="0" distR="0" wp14:anchorId="2449BF99" wp14:editId="5071EF99">
+            <wp:extent cx="6120765" cy="5140960"/>
+            <wp:effectExtent l="0" t="0" r="0" b="2540"/>
+            <wp:docPr id="1" name="Picture 1"/>
+            <wp:cNvGraphicFramePr>
+              <a:graphicFrameLocks xmlns:a="http://schemas.openxmlformats.org/drawingml/2006/main" noChangeAspect="1"/>
+            </wp:cNvGraphicFramePr>
+            <a:graphic xmlns:a="http://schemas.openxmlformats.org/drawingml/2006/main">
+              <a:graphicData uri="http://schemas.openxmlformats.org/drawingml/2006/picture">
+                <pic:pic xmlns:pic="http://schemas.openxmlformats.org/drawingml/2006/picture">
+                  <pic:nvPicPr>
+                    <pic:cNvPr id="1" name=""/>
+                    <pic:cNvPicPr/>
+                  </pic:nvPicPr>
+                  <pic:blipFill>
+                    <a:blip r:embed="rId4"/>
+                    <a:stretch>
+                      <a:fillRect/>
+                    </a:stretch>
+                  </pic:blipFill>
+                  <pic:spPr>
+                    <a:xfrm>
+                      <a:off x="0" y="0"/>
+                      <a:ext cx="6120765" cy="5140960"/>
+                    </a:xfrm>
+                    <a:prstGeom prst="rect">
+                      <a:avLst/>
+                    </a:prstGeom>
+                  </pic:spPr>
+                </pic:pic>
+              </a:graphicData>
+            </a:graphic>
+          </wp:inline>
+        </w:drawing>
+      </w:r>
+    </w:p>
+    <w:p>
+      <w:pPr>
         <w:rPr>
           <w:b/>
           <w:bCs/>
           <w:lang w:val="en-US"/>
         </w:rPr>
+      </w:pPr>
+      <w:r>
+        <w:rPr>
+          <w:b/>
+          <w:bCs/>
+        </w:rPr>
+        <w:br/>
+      </w:r>
+      <w:r>
+        <w:rPr>
+          <w:b/>
+          <w:bCs/>
+        </w:rPr>
+        <w:t>Код</w:t>
+      </w:r>
+      <w:r>
+        <w:rPr>
+          <w:b/>
+          <w:bCs/>
+          <w:lang w:val="en-US"/>
+        </w:rPr>
+        <w:t xml:space="preserve">: </w:t>
+      </w:r>
+    </w:p>
+    <w:p>
+      <w:pPr>
+        <w:rPr>
+          <w:b/>
+          <w:bCs/>
+          <w:lang w:val="en-US"/>
+        </w:rPr>
+      </w:pPr>
+      <w:r>
+        <w:rPr>
+          <w:b/>
+          <w:bCs/>
+        </w:rPr>
+        <w:t>Висновок</w:t>
+      </w:r>
+      <w:r>
+        <w:rPr>
+          <w:b/>
+          <w:bCs/>
+          <w:lang w:val="en-US"/>
+        </w:rPr>
+        <w:t>:</w:t>
+      </w:r>
+      <w:r>
+        <w:rPr>
+          <w:b/>
+          <w:bCs/>
+        </w:rPr>
         <w:t xml:space="preserve"> </w:t>
       </w:r>
       <w:r>
-        <w:t>у ході виконання лабораторної роботи була виконана лабораторна робота</w:t>
-      </w:r>
-      <w:r>
-        <w:t xml:space="preserve"> і було вивчено систему </w:t>
-      </w:r>
-      <w:r>
+        <w:t>Я навчився з</w:t>
+      </w:r>
+      <w:r>
+        <w:t>акріпити здобуті знання про структуру URL Навчитися формувати URL для запиту відповідно до задокументованих вимог</w:t>
+      </w:r>
+      <w:r>
+        <w:t xml:space="preserve">. </w:t>
+      </w:r>
+      <w:r>
+        <w:t>Навчитися виконувати запит за допомогою curl</w:t>
+      </w:r>
+      <w:r>
+        <w:t>.</w:t>
+      </w:r>
+      <w:r>
+        <w:t xml:space="preserve"> Навчитися працювати зі змінними та класом URL</w:t>
+      </w:r>
+    </w:p>
+    <w:p/>
+    <w:p>
+      <w:pPr>
         <w:rPr>
           <w:lang w:val="en-US"/>
         </w:rPr>
-        <w:t>git</w:t>
-      </w:r>
-      <w:r>
-        <w:t xml:space="preserve"> і створено </w:t>
-      </w:r>
+      </w:pPr>
       <w:r>
         <w:rPr>
           <w:lang w:val="en-US"/>
         </w:rPr>
-        <w:t xml:space="preserve">node.js hello world </w:t>
-      </w:r>
-      <w:r>
-        <w:t>файл</w:t>
-      </w:r>
-      <w:r>
-        <w:t xml:space="preserve">. </w:t>
-      </w:r>
-      <w:proofErr w:type="spellStart"/>
-      <w:r>
+        <w:t>https://github.com/ArturLys/web-labs</w:t>
+      </w:r>
+    </w:p>
+    <w:p>
+      <w:pPr>
         <w:rPr>
           <w:lang w:val="en-US"/>
         </w:rPr>
-        <w:t>Github</w:t>
-      </w:r>
-      <w:proofErr w:type="spellEnd"/>
-      <w:r>
-        <w:rPr>
-          <w:lang w:val="en-US"/>
-        </w:rPr>
-        <w:t xml:space="preserve"> </w:t>
-      </w:r>
-      <w:r>
-        <w:t>акаунт в мене був</w:t>
-      </w:r>
+      </w:pPr>
     </w:p>
     <w:sectPr>
       <w:pgSz w:w="11906" w:h="16838"/>

</xml_diff>